<commit_message>
@ Guida Word/PDF: emoji semaforo rese con pallino colorato (visibili nel PDF)
Le emoji 🟢🟡🔴 uscivano come quadratini (non nei font PDF standard). Il convertitore
ora le rende con un "●" colorato (verde/ambra/rosso), presente in ogni font.
Rigenerati docx e pdf.

Co-Authored-By: Claude Opus 4.8 <noreply@anthropic.com>
@
</commit_message>
<xml_diff>
--- a/docs/guida-costo-prodotto.docx
+++ b/docs/guida-costo-prodotto.docx
@@ -210,7 +210,14 @@
         <w:pStyle w:val="ListBullet"/>
       </w:pPr>
       <w:r>
-        <w:t xml:space="preserve">🟢 </w:t>
+        <w:rPr>
+          <w:b/>
+          <w:color w:val="1A7F37"/>
+        </w:rPr>
+        <w:t>●</w:t>
+      </w:r>
+      <w:r>
+        <w:t xml:space="preserve"> </w:t>
       </w:r>
       <w:r>
         <w:rPr>
@@ -227,7 +234,14 @@
         <w:pStyle w:val="ListBullet"/>
       </w:pPr>
       <w:r>
-        <w:t xml:space="preserve">🟡 </w:t>
+        <w:rPr>
+          <w:b/>
+          <w:color w:val="C98A00"/>
+        </w:rPr>
+        <w:t>●</w:t>
+      </w:r>
+      <w:r>
+        <w:t xml:space="preserve"> </w:t>
       </w:r>
       <w:r>
         <w:rPr>
@@ -244,7 +258,14 @@
         <w:pStyle w:val="ListBullet"/>
       </w:pPr>
       <w:r>
-        <w:t xml:space="preserve">🔴 </w:t>
+        <w:rPr>
+          <w:b/>
+          <w:color w:val="C0392B"/>
+        </w:rPr>
+        <w:t>●</w:t>
+      </w:r>
+      <w:r>
+        <w:t xml:space="preserve"> </w:t>
       </w:r>
       <w:r>
         <w:rPr>
@@ -270,7 +291,27 @@
         <w:t>Indice di qualità</w:t>
       </w:r>
       <w:r>
-        <w:t xml:space="preserve"> (% del valore di magazzino già a posto o certificato). La lista mostra solo i casi 🟡/🔴 con il motivo. Per ognuno si può </w:t>
+        <w:t xml:space="preserve"> (% del valore di magazzino già a posto o certificato). La lista mostra solo i casi </w:t>
+      </w:r>
+      <w:r>
+        <w:rPr>
+          <w:b/>
+          <w:color w:val="C98A00"/>
+        </w:rPr>
+        <w:t>●</w:t>
+      </w:r>
+      <w:r>
+        <w:t>/</w:t>
+      </w:r>
+      <w:r>
+        <w:rPr>
+          <w:b/>
+          <w:color w:val="C0392B"/>
+        </w:rPr>
+        <w:t>●</w:t>
+      </w:r>
+      <w:r>
+        <w:t xml:space="preserve"> con il motivo. Per ognuno si può </w:t>
       </w:r>
       <w:r>
         <w:rPr>
@@ -590,7 +631,14 @@
         <w:pStyle w:val="ListBullet"/>
       </w:pPr>
       <w:r>
-        <w:t xml:space="preserve">🟡 </w:t>
+        <w:rPr>
+          <w:b/>
+          <w:color w:val="C98A00"/>
+        </w:rPr>
+        <w:t>●</w:t>
+      </w:r>
+      <w:r>
+        <w:t xml:space="preserve"> </w:t>
       </w:r>
       <w:r>
         <w:rPr>
@@ -610,7 +658,14 @@
         <w:pStyle w:val="ListBullet"/>
       </w:pPr>
       <w:r>
-        <w:t xml:space="preserve">🟢 </w:t>
+        <w:rPr>
+          <w:b/>
+          <w:color w:val="1A7F37"/>
+        </w:rPr>
+        <w:t>●</w:t>
+      </w:r>
+      <w:r>
+        <w:t xml:space="preserve"> </w:t>
       </w:r>
       <w:r>
         <w:rPr>
@@ -817,7 +872,27 @@
         <w:pStyle w:val="ListBullet"/>
       </w:pPr>
       <w:r>
-        <w:t xml:space="preserve">Articoli 🔴/🟡 non certificati = il loro costo è </w:t>
+        <w:t xml:space="preserve">Articoli </w:t>
+      </w:r>
+      <w:r>
+        <w:rPr>
+          <w:b/>
+          <w:color w:val="C0392B"/>
+        </w:rPr>
+        <w:t>●</w:t>
+      </w:r>
+      <w:r>
+        <w:t>/</w:t>
+      </w:r>
+      <w:r>
+        <w:rPr>
+          <w:b/>
+          <w:color w:val="C98A00"/>
+        </w:rPr>
+        <w:t>●</w:t>
+      </w:r>
+      <w:r>
+        <w:t xml:space="preserve"> non certificati = il loro costo è </w:t>
       </w:r>
       <w:r>
         <w:rPr>

</xml_diff>